<commit_message>
Update buyer guide with WorkBuddy and Doubao Work
</commit_message>
<xml_diff>
--- a/docs/quickstart.docx
+++ b/docs/quickstart.docx
@@ -32,7 +32,7 @@
           <w:rPr>
             <w:color w:val="235D9F"/>
           </w:rPr>
-          <w:t>TRAE</w:t>
+          <w:t>WorkBuddy</w:t>
         </w:r>
       </w:hyperlink>
       <w:r>
@@ -43,7 +43,7 @@
           <w:rPr>
             <w:color w:val="235D9F"/>
           </w:rPr>
-          <w:t>Qoder</w:t>
+          <w:t>豆包工作</w:t>
         </w:r>
       </w:hyperlink>
       <w:r>
@@ -54,11 +54,11 @@
           <w:rPr>
             <w:color w:val="235D9F"/>
           </w:rPr>
-          <w:t>通义灵码</w:t>
+          <w:t>TRAE</w:t>
         </w:r>
       </w:hyperlink>
       <w:r>
-        <w:t xml:space="preserve">；海外可选 </w:t>
+        <w:t xml:space="preserve"> 等；海外可选 </w:t>
       </w:r>
       <w:hyperlink r:id="rId12">
         <w:r>
@@ -91,12 +91,12 @@
         </w:r>
       </w:hyperlink>
       <w:r>
-        <w:t>。点击名称可进入官方入口。</w:t>
+        <w:t xml:space="preserve"> 等。点击名称可进入官方入口。</w:t>
       </w:r>
     </w:p>
     <w:p>
       <w:r>
-        <w:t>安装并登录其中一个，使用能读写本机文件、运行终端的本地 Agent 模式。纯网页聊天或云端任务不能直接把文件存到你的电脑。工具的可用地区、账号与额度要求以官网为准。</w:t>
+        <w:t>任选一个工具，安装并登录后，启用本地文件操作能力，允许它将项目下载到你的电脑。使用电脑客户端，并确认任务能访问本机文件夹。工具的可用地区、账号与额度要求以官网为准。</w:t>
       </w:r>
     </w:p>
     <w:p>

</xml_diff>